<commit_message>
List 18 Task #89, 90, 91, 92 Academic Coversheet Changes
</commit_message>
<xml_diff>
--- a/StudentBinder/ASTemplates/ASTemplateStart.docx
+++ b/StudentBinder/ASTemplates/ASTemplateStart.docx
@@ -80,7 +80,7 @@
                           </pic:cNvPicPr>
                         </pic:nvPicPr>
                         <pic:blipFill>
-                          <a:blip r:embed="rId5"/>
+                          <a:blip r:embed="rId4"/>
                           <a:stretch>
                             <a:fillRect/>
                           </a:stretch>
@@ -491,6 +491,12 @@
             <w:insideH w:val="single" w:color="auto" w:sz="4" w:space="0"/>
             <w:insideV w:val="single" w:color="auto" w:sz="4" w:space="0"/>
           </w:tblBorders>
+          <w:tblCellMar>
+            <w:top w:w="0" w:type="dxa"/>
+            <w:left w:w="108" w:type="dxa"/>
+            <w:bottom w:w="0" w:type="dxa"/>
+            <w:right w:w="108" w:type="dxa"/>
+          </w:tblCellMar>
         </w:tblPrEx>
         <w:trPr>
           <w:trHeight w:val="372" w:hRule="atLeast"/>
@@ -653,12 +659,6 @@
             <w:insideH w:val="single" w:color="auto" w:sz="4" w:space="0"/>
             <w:insideV w:val="single" w:color="auto" w:sz="4" w:space="0"/>
           </w:tblBorders>
-          <w:tblCellMar>
-            <w:top w:w="0" w:type="dxa"/>
-            <w:left w:w="108" w:type="dxa"/>
-            <w:bottom w:w="0" w:type="dxa"/>
-            <w:right w:w="108" w:type="dxa"/>
-          </w:tblCellMar>
         </w:tblPrEx>
         <w:trPr>
           <w:trHeight w:val="318" w:hRule="atLeast"/>
@@ -1096,111 +1096,20 @@
         </w:tc>
       </w:tr>
     </w:tbl>
+    <w:p/>
     <w:p>
       <w:bookmarkStart w:id="0" w:name="_GoBack"/>
       <w:bookmarkEnd w:id="0"/>
     </w:p>
-    <w:p/>
     <w:sectPr>
-      <w:footerReference r:id="rId3" w:type="default"/>
       <w:pgSz w:w="11907" w:h="16839"/>
-      <w:pgMar w:top="432" w:right="720" w:bottom="720" w:left="446" w:header="806" w:footer="576" w:gutter="0"/>
-      <w:cols w:space="720" w:num="1"/>
+      <w:pgMar w:top="431" w:right="720" w:bottom="720" w:left="446" w:header="57" w:footer="578" w:gutter="0"/>
+      <w:cols w:space="0" w:num="1"/>
+      <w:rtlGutter w:val="0"/>
       <w:docGrid w:linePitch="360" w:charSpace="0"/>
     </w:sectPr>
   </w:body>
 </w:document>
-</file>
-
-<file path=word/footer1.xml><?xml version="1.0" encoding="utf-8"?>
-<w:ftr xmlns:wpc="http://schemas.microsoft.com/office/word/2010/wordprocessingCanvas" xmlns:mc="http://schemas.openxmlformats.org/markup-compatibility/2006" xmlns:o="urn:schemas-microsoft-com:office:office" xmlns:r="http://schemas.openxmlformats.org/officeDocument/2006/relationships" xmlns:m="http://schemas.openxmlformats.org/officeDocument/2006/math" xmlns:v="urn:schemas-microsoft-com:vml" xmlns:wp14="http://schemas.microsoft.com/office/word/2010/wordprocessingDrawing" xmlns:wp="http://schemas.openxmlformats.org/drawingml/2006/wordprocessingDrawing" xmlns:w10="urn:schemas-microsoft-com:office:word" xmlns:w="http://schemas.openxmlformats.org/wordprocessingml/2006/main" xmlns:w14="http://schemas.microsoft.com/office/word/2010/wordml" xmlns:w15="http://schemas.microsoft.com/office/word/2012/wordml" xmlns:wpg="http://schemas.microsoft.com/office/word/2010/wordprocessingGroup" xmlns:wpi="http://schemas.microsoft.com/office/word/2010/wordprocessingInk" xmlns:wne="http://schemas.microsoft.com/office/word/2006/wordml" xmlns:wps="http://schemas.microsoft.com/office/word/2010/wordprocessingShape" xmlns:wpsCustomData="http://www.wps.cn/officeDocument/2013/wpsCustomData" mc:Ignorable="w14 w15 wp14">
-  <w:p>
-    <w:pPr>
-      <w:pStyle w:val="4"/>
-      <w:rPr>
-        <w:sz w:val="16"/>
-      </w:rPr>
-    </w:pPr>
-    <w:r>
-      <w:rPr>
-        <w:sz w:val="16"/>
-      </w:rPr>
-      <w:tab/>
-    </w:r>
-    <w:r>
-      <w:rPr>
-        <w:sz w:val="16"/>
-      </w:rPr>
-      <w:t xml:space="preserve">Page </w:t>
-    </w:r>
-    <w:r>
-      <w:rPr>
-        <w:sz w:val="16"/>
-      </w:rPr>
-      <w:fldChar w:fldCharType="begin"/>
-    </w:r>
-    <w:r>
-      <w:rPr>
-        <w:sz w:val="16"/>
-      </w:rPr>
-      <w:instrText xml:space="preserve"> PAGE </w:instrText>
-    </w:r>
-    <w:r>
-      <w:rPr>
-        <w:sz w:val="16"/>
-      </w:rPr>
-      <w:fldChar w:fldCharType="separate"/>
-    </w:r>
-    <w:r>
-      <w:rPr>
-        <w:sz w:val="16"/>
-      </w:rPr>
-      <w:t>1</w:t>
-    </w:r>
-    <w:r>
-      <w:rPr>
-        <w:sz w:val="16"/>
-      </w:rPr>
-      <w:fldChar w:fldCharType="end"/>
-    </w:r>
-    <w:r>
-      <w:rPr>
-        <w:sz w:val="16"/>
-      </w:rPr>
-      <w:tab/>
-    </w:r>
-    <w:r>
-      <w:rPr>
-        <w:sz w:val="16"/>
-      </w:rPr>
-      <w:fldChar w:fldCharType="begin"/>
-    </w:r>
-    <w:r>
-      <w:rPr>
-        <w:sz w:val="16"/>
-      </w:rPr>
-      <w:instrText xml:space="preserve"> DATE </w:instrText>
-    </w:r>
-    <w:r>
-      <w:rPr>
-        <w:sz w:val="16"/>
-      </w:rPr>
-      <w:fldChar w:fldCharType="separate"/>
-    </w:r>
-    <w:r>
-      <w:rPr>
-        <w:sz w:val="16"/>
-      </w:rPr>
-      <w:t>2/16/24</w:t>
-    </w:r>
-    <w:r>
-      <w:rPr>
-        <w:sz w:val="16"/>
-      </w:rPr>
-      <w:fldChar w:fldCharType="end"/>
-    </w:r>
-  </w:p>
-</w:ftr>
 </file>
 
 <file path=word/styles.xml><?xml version="1.0" encoding="utf-8"?>

</xml_diff>